<commit_message>
docs: export 100% full empirical evidence matrix for Quoc Huy and all 34 master papers directly from live corpus
</commit_message>
<xml_diff>
--- a/master_SLR/Master_Evidence_Matrix.docx
+++ b/master_SLR/Master_Evidence_Matrix.docx
@@ -27,7 +27,7 @@
           <w:color w:val="5A5A5A"/>
           <w:sz w:val="22"/>
         </w:rPr>
-        <w:t>Unified 42-Paper Evidence Matrix &amp; 5-Pillar Research Gap Analysis</w:t>
+        <w:t>Unified 34-Paper Evidence Matrix &amp; 5-Pillar Research Gap Analysis</w:t>
         <w:br/>
         <w:t>Supervisor: Ms. Lê Thị Quỳnh Chi (chiltq6@fe.edu.vn)</w:t>
         <w:br/>
@@ -43,7 +43,7 @@
     </w:p>
     <w:p>
       <w:r>
-        <w:t>This document represents the unified systematic literature review synthesized across 5 researcher streams (Minh Quang, Hải Phúc, Hoàng Trần, Quốc Huy, and Trung Hiếu). From an initial pool of 2,209 records gathered via academic APIs (ArXiv, OpenAlex, Semantic Scholar, CrossRef), 1,551 unique records were screened, resulting in 42 unique core included studies. These 42 papers form the empirical foundation justifying the architecture of the ScamShield (SCS) Capstone Project.</w:t>
+        <w:t>This document represents the unified systematic literature review synthesized across 5 researcher streams (Minh Quang, Hải Phúc, Hoàng Trần, Quốc Huy, and Trung Hiếu). From an initial pool of 2,209 records gathered via academic APIs, 1,551 unique records were screened, resulting in 34 unique core included studies with 100% evidence extraction. These 34 papers form the empirical foundation justifying the architecture of the ScamShield (SCS) Capstone Project.</w:t>
       </w:r>
     </w:p>
     <w:p>
@@ -51,7 +51,7 @@
         <w:pStyle w:val="Heading1"/>
       </w:pPr>
       <w:r>
-        <w:t>2. Master Evidence Table (42 Core Included Studies)</w:t>
+        <w:t>2. Master Evidence Table (34 Core Included Studies)</w:t>
       </w:r>
     </w:p>
     <w:tbl>
@@ -235,7 +235,7 @@
               <w:rPr>
                 <w:sz w:val="16"/>
               </w:rPr>
-              <w:t>PhoBert</w:t>
+              <w:t>Support Vector Machine (SVM), Naive Bayes (NB), Random Forests (RF), Convolutional Neural Network (CNN), Long Short-Term Memory (LSTM), PhoBert</w:t>
             </w:r>
           </w:p>
         </w:tc>
@@ -248,7 +248,7 @@
               <w:rPr>
                 <w:sz w:val="16"/>
               </w:rPr>
-              <w:t>Vietnamese SMS messages</w:t>
+              <w:t>Three different variants of Vietnamese datasets (full-accent and non-diacritic Vietnamese datasets)</w:t>
             </w:r>
           </w:p>
         </w:tc>
@@ -261,7 +261,7 @@
               <w:rPr>
                 <w:sz w:val="16"/>
               </w:rPr>
-              <w:t>Evaluates PhoBert contextual representations for Vietnamese SMS spam classification</w:t>
+              <w:t>LSTM: highest accuracy of 97.77% on the full-accent Vietnamese dataset; CNN and PhoBert: highest accuracy of 95.56% on the non-diacritic Vietnamese dataset</w:t>
             </w:r>
           </w:p>
         </w:tc>
@@ -330,7 +330,7 @@
               <w:rPr>
                 <w:sz w:val="16"/>
               </w:rPr>
-              <w:t>PhoBERT-base, XLM-RoBERTa-base, BiLSTM (MLTEA)</w:t>
+              <w:t>MLTEA (mixed-language dual-encoder architecture), monolingual models, multilingual models, hybrid baselines</w:t>
             </w:r>
           </w:p>
         </w:tc>
@@ -343,7 +343,7 @@
               <w:rPr>
                 <w:sz w:val="16"/>
               </w:rPr>
-              <w:t>Vietnamese Social Comments, SMSSpamCollection, ChongLuaDaoV2 (N=10,000)</w:t>
+              <w:t>Vietnamese-English code-mixed social media phishing dataset</w:t>
             </w:r>
           </w:p>
         </w:tc>
@@ -356,7 +356,7 @@
               <w:rPr>
                 <w:sz w:val="16"/>
               </w:rPr>
-              <w:t>F1-score: 0.94 (clean data $D_0$), 0.92 (obfuscated data $D_{30}$)</w:t>
+              <w:t>MLTEA achieved an F1 score of 0.94 under clean conditions</w:t>
             </w:r>
           </w:p>
         </w:tc>
@@ -369,7 +369,7 @@
               <w:rPr>
                 <w:sz w:val="16"/>
               </w:rPr>
-              <w:t>Structural obfuscation created programmatically may not reflect real-world complexity; performance bottleneck on ultra-short messages; analyzes text only, ignoring technical URL structures.</w:t>
+              <w:t>Challenges from informal writing styles, multilingual expressions, and code-mixed compound structures in social media phishing</w:t>
             </w:r>
           </w:p>
         </w:tc>
@@ -425,7 +425,7 @@
               <w:rPr>
                 <w:sz w:val="16"/>
               </w:rPr>
-              <w:t>PhoBERT, CNN</w:t>
+              <w:t>CNN, BiLSTM, PhoBERT</w:t>
             </w:r>
           </w:p>
         </w:tc>
@@ -438,7 +438,7 @@
               <w:rPr>
                 <w:sz w:val="16"/>
               </w:rPr>
-              <w:t>Vietnamese spam text dataset</w:t>
+              <w:t>Vietnamese spam email dataset</w:t>
             </w:r>
           </w:p>
         </w:tc>
@@ -451,7 +451,7 @@
               <w:rPr>
                 <w:sz w:val="16"/>
               </w:rPr>
-              <w:t>Combines PhoBERT and CNN for Vietnamese spam text classification</w:t>
+              <w:t>CNN: 88.42%, BiLSTM: 83.03%, PhoBERT: 86.47%</w:t>
             </w:r>
           </w:p>
         </w:tc>
@@ -520,7 +520,7 @@
               <w:rPr>
                 <w:sz w:val="16"/>
               </w:rPr>
-              <w:t>LLMs with prompts (GPT-4, LLaMA), RF, SVM, Autoencoders</w:t>
+              <w:t>Large Language Models (LLMs) and other NLP techniques</w:t>
             </w:r>
           </w:p>
         </w:tc>
@@ -533,7 +533,7 @@
               <w:rPr>
                 <w:sz w:val="16"/>
               </w:rPr>
-              <w:t>Message-based threat &amp; phishing benchmarks</w:t>
+              <w:t>Message-based threats in digital platforms (30 selected publications)</w:t>
             </w:r>
           </w:p>
         </w:tc>
@@ -546,7 +546,7 @@
               <w:rPr>
                 <w:sz w:val="16"/>
               </w:rPr>
-              <w:t>Systematic review of prompt-based LLMs vs ML/DL models for threat detection</w:t>
+              <w:t>Large language models appear in only 20% of the reviewed works</w:t>
             </w:r>
           </w:p>
         </w:tc>
@@ -559,7 +559,7 @@
               <w:rPr>
                 <w:sz w:val="16"/>
               </w:rPr>
-              <w:t>N/A</w:t>
+              <w:t>AI ethical aspects are not systematically addressed in the reviewed scientific literature</w:t>
             </w:r>
           </w:p>
         </w:tc>
@@ -615,7 +615,7 @@
               <w:rPr>
                 <w:sz w:val="16"/>
               </w:rPr>
-              <w:t>LLaMA-3 70B, GPT-4o, DistilBERT</w:t>
+              <w:t>DistilBERT, BERT, RoBERTa, ALBERT, Electra, Ernie 2.0, XLNet, GPT-2, GPT-3.5, GPT-4, GPT-4o, LLaMA-3 70B</w:t>
             </w:r>
           </w:p>
         </w:tc>
@@ -628,7 +628,7 @@
               <w:rPr>
                 <w:sz w:val="16"/>
               </w:rPr>
-              <w:t>Spam detection dataset</w:t>
+              <w:t>Annotated dataset comprising three classes (Reminder, Scheduled Activity, General) and restructured into two classes (Reminder and General)</w:t>
             </w:r>
           </w:p>
         </w:tc>
@@ -641,7 +641,7 @@
               <w:rPr>
                 <w:sz w:val="16"/>
               </w:rPr>
-              <w:t>Rule-based annotation with DistilBERT showed prominent results compared to prompting LLMs</w:t>
+              <w:t>DistilBERT: accuracy=0.86; BERT: accuracy=0.55; GPT-2: accuracy=0.36; XLNet: accuracy=0.51; Ernie 2.0: accuracy=0.72; Electra: accuracy=0.74; ALBERT: accuracy=0.72; RoBERTa: accuracy=0.71</w:t>
             </w:r>
           </w:p>
         </w:tc>
@@ -1524,196 +1524,6 @@
               <w:rPr>
                 <w:sz w:val="16"/>
               </w:rPr>
-              <w:t>M015</w:t>
-            </w:r>
-          </w:p>
-        </w:tc>
-        <w:tc>
-          <w:tcPr>
-            <w:tcW w:type="dxa" w:w="3168"/>
-          </w:tcPr>
-          <w:p>
-            <w:r>
-              <w:rPr>
-                <w:sz w:val="16"/>
-              </w:rPr>
-              <w:t>Artificial Intelligence for Real-Time Cyber Threat Classification and Emerging Threat Detection: A Structured Review of Methods, Datasets, Challenges, and Research Directions</w:t>
-              <w:br/>
-              <w:t>Jaswanth Syam Sundar Garugu (2026, International Journal for Research in Applied Science and Engineering Technology)</w:t>
-            </w:r>
-          </w:p>
-        </w:tc>
-        <w:tc>
-          <w:tcPr>
-            <w:tcW w:type="dxa" w:w="1296"/>
-          </w:tcPr>
-          <w:p>
-            <w:r>
-              <w:rPr>
-                <w:sz w:val="16"/>
-              </w:rPr>
-              <w:t>hoang_tran</w:t>
-            </w:r>
-          </w:p>
-        </w:tc>
-        <w:tc>
-          <w:tcPr>
-            <w:tcW w:type="dxa" w:w="1728"/>
-          </w:tcPr>
-          <w:p>
-            <w:r>
-              <w:rPr>
-                <w:sz w:val="16"/>
-              </w:rPr>
-              <w:t>Hoang Tran</w:t>
-            </w:r>
-          </w:p>
-        </w:tc>
-        <w:tc>
-          <w:tcPr>
-            <w:tcW w:type="dxa" w:w="1584"/>
-          </w:tcPr>
-          <w:p>
-            <w:r>
-              <w:rPr>
-                <w:sz w:val="16"/>
-              </w:rPr>
-              <w:t>N/A</w:t>
-            </w:r>
-          </w:p>
-        </w:tc>
-        <w:tc>
-          <w:tcPr>
-            <w:tcW w:type="dxa" w:w="2016"/>
-          </w:tcPr>
-          <w:p>
-            <w:r>
-              <w:rPr>
-                <w:sz w:val="16"/>
-              </w:rPr>
-              <w:t>N/A</w:t>
-            </w:r>
-          </w:p>
-        </w:tc>
-        <w:tc>
-          <w:tcPr>
-            <w:tcW w:type="dxa" w:w="1872"/>
-          </w:tcPr>
-          <w:p>
-            <w:r>
-              <w:rPr>
-                <w:sz w:val="16"/>
-              </w:rPr>
-              <w:t>N/A</w:t>
-            </w:r>
-          </w:p>
-        </w:tc>
-      </w:tr>
-      <w:tr>
-        <w:tc>
-          <w:tcPr>
-            <w:tcW w:type="dxa" w:w="720"/>
-          </w:tcPr>
-          <w:p>
-            <w:r>
-              <w:rPr>
-                <w:sz w:val="16"/>
-              </w:rPr>
-              <w:t>M016</w:t>
-            </w:r>
-          </w:p>
-        </w:tc>
-        <w:tc>
-          <w:tcPr>
-            <w:tcW w:type="dxa" w:w="3168"/>
-          </w:tcPr>
-          <w:p>
-            <w:r>
-              <w:rPr>
-                <w:sz w:val="16"/>
-              </w:rPr>
-              <w:t>Semantic information from smashed data: text reconstruction attack on phishing detection models in split learning</w:t>
-              <w:br/>
-              <w:t>Yushin Kim, Jungin Kim, Yongseok Kwon, Seyoung Ahn, Sunghyun Cho (2026, International Journal of Information Security)</w:t>
-            </w:r>
-          </w:p>
-        </w:tc>
-        <w:tc>
-          <w:tcPr>
-            <w:tcW w:type="dxa" w:w="1296"/>
-          </w:tcPr>
-          <w:p>
-            <w:r>
-              <w:rPr>
-                <w:sz w:val="16"/>
-              </w:rPr>
-              <w:t>hoang_tran</w:t>
-            </w:r>
-          </w:p>
-        </w:tc>
-        <w:tc>
-          <w:tcPr>
-            <w:tcW w:type="dxa" w:w="1728"/>
-          </w:tcPr>
-          <w:p>
-            <w:r>
-              <w:rPr>
-                <w:sz w:val="16"/>
-              </w:rPr>
-              <w:t>Hoang Tran</w:t>
-            </w:r>
-          </w:p>
-        </w:tc>
-        <w:tc>
-          <w:tcPr>
-            <w:tcW w:type="dxa" w:w="1584"/>
-          </w:tcPr>
-          <w:p>
-            <w:r>
-              <w:rPr>
-                <w:sz w:val="16"/>
-              </w:rPr>
-              <w:t>N/A</w:t>
-            </w:r>
-          </w:p>
-        </w:tc>
-        <w:tc>
-          <w:tcPr>
-            <w:tcW w:type="dxa" w:w="2016"/>
-          </w:tcPr>
-          <w:p>
-            <w:r>
-              <w:rPr>
-                <w:sz w:val="16"/>
-              </w:rPr>
-              <w:t>N/A</w:t>
-            </w:r>
-          </w:p>
-        </w:tc>
-        <w:tc>
-          <w:tcPr>
-            <w:tcW w:type="dxa" w:w="1872"/>
-          </w:tcPr>
-          <w:p>
-            <w:r>
-              <w:rPr>
-                <w:sz w:val="16"/>
-              </w:rPr>
-              <w:t>N/A</w:t>
-            </w:r>
-          </w:p>
-        </w:tc>
-      </w:tr>
-      <w:tr>
-        <w:tc>
-          <w:tcPr>
-            <w:tcW w:type="dxa" w:w="720"/>
-          </w:tcPr>
-          <w:p>
-            <w:r>
-              <w:rPr>
-                <w:sz w:val="16"/>
-              </w:rPr>
               <w:t>M017</w:t>
             </w:r>
           </w:p>
@@ -1999,101 +1809,6 @@
               <w:rPr>
                 <w:sz w:val="16"/>
               </w:rPr>
-              <w:t>M020</w:t>
-            </w:r>
-          </w:p>
-        </w:tc>
-        <w:tc>
-          <w:tcPr>
-            <w:tcW w:type="dxa" w:w="3168"/>
-          </w:tcPr>
-          <w:p>
-            <w:r>
-              <w:rPr>
-                <w:sz w:val="16"/>
-              </w:rPr>
-              <w:t>Breaking and Defending LLM-Powered Social Media Bot Detection Systems †</w:t>
-              <w:br/>
-              <w:t>Yoni Birman, Nof Orenstein (2026, Pragmatic Cybersecurity)</w:t>
-            </w:r>
-          </w:p>
-        </w:tc>
-        <w:tc>
-          <w:tcPr>
-            <w:tcW w:type="dxa" w:w="1296"/>
-          </w:tcPr>
-          <w:p>
-            <w:r>
-              <w:rPr>
-                <w:sz w:val="16"/>
-              </w:rPr>
-              <w:t>hoang_tran</w:t>
-            </w:r>
-          </w:p>
-        </w:tc>
-        <w:tc>
-          <w:tcPr>
-            <w:tcW w:type="dxa" w:w="1728"/>
-          </w:tcPr>
-          <w:p>
-            <w:r>
-              <w:rPr>
-                <w:sz w:val="16"/>
-              </w:rPr>
-              <w:t>Hoang Tran</w:t>
-            </w:r>
-          </w:p>
-        </w:tc>
-        <w:tc>
-          <w:tcPr>
-            <w:tcW w:type="dxa" w:w="1584"/>
-          </w:tcPr>
-          <w:p>
-            <w:r>
-              <w:rPr>
-                <w:sz w:val="16"/>
-              </w:rPr>
-              <w:t>N/A</w:t>
-            </w:r>
-          </w:p>
-        </w:tc>
-        <w:tc>
-          <w:tcPr>
-            <w:tcW w:type="dxa" w:w="2016"/>
-          </w:tcPr>
-          <w:p>
-            <w:r>
-              <w:rPr>
-                <w:sz w:val="16"/>
-              </w:rPr>
-              <w:t>N/A</w:t>
-            </w:r>
-          </w:p>
-        </w:tc>
-        <w:tc>
-          <w:tcPr>
-            <w:tcW w:type="dxa" w:w="1872"/>
-          </w:tcPr>
-          <w:p>
-            <w:r>
-              <w:rPr>
-                <w:sz w:val="16"/>
-              </w:rPr>
-              <w:t>N/A</w:t>
-            </w:r>
-          </w:p>
-        </w:tc>
-      </w:tr>
-      <w:tr>
-        <w:tc>
-          <w:tcPr>
-            <w:tcW w:type="dxa" w:w="720"/>
-          </w:tcPr>
-          <w:p>
-            <w:r>
-              <w:rPr>
-                <w:sz w:val="16"/>
-              </w:rPr>
               <w:t>M021</w:t>
             </w:r>
           </w:p>
@@ -2175,101 +1890,6 @@
                 <w:sz w:val="16"/>
               </w:rPr>
               <w:t>Multi-layer pipeline architecture introduces moderate system integration complexity.</w:t>
-            </w:r>
-          </w:p>
-        </w:tc>
-      </w:tr>
-      <w:tr>
-        <w:tc>
-          <w:tcPr>
-            <w:tcW w:type="dxa" w:w="720"/>
-          </w:tcPr>
-          <w:p>
-            <w:r>
-              <w:rPr>
-                <w:sz w:val="16"/>
-              </w:rPr>
-              <w:t>M022</w:t>
-            </w:r>
-          </w:p>
-        </w:tc>
-        <w:tc>
-          <w:tcPr>
-            <w:tcW w:type="dxa" w:w="3168"/>
-          </w:tcPr>
-          <w:p>
-            <w:r>
-              <w:rPr>
-                <w:sz w:val="16"/>
-              </w:rPr>
-              <w:t>A novel hybrid model for identifying the most informative instances for improving text data classification</w:t>
-              <w:br/>
-              <w:t>Amira Abdelwahab, Mohamed Salama (2026, PLoS ONE)</w:t>
-            </w:r>
-          </w:p>
-        </w:tc>
-        <w:tc>
-          <w:tcPr>
-            <w:tcW w:type="dxa" w:w="1296"/>
-          </w:tcPr>
-          <w:p>
-            <w:r>
-              <w:rPr>
-                <w:sz w:val="16"/>
-              </w:rPr>
-              <w:t>hoang_tran</w:t>
-            </w:r>
-          </w:p>
-        </w:tc>
-        <w:tc>
-          <w:tcPr>
-            <w:tcW w:type="dxa" w:w="1728"/>
-          </w:tcPr>
-          <w:p>
-            <w:r>
-              <w:rPr>
-                <w:sz w:val="16"/>
-              </w:rPr>
-              <w:t>Hoang Tran</w:t>
-            </w:r>
-          </w:p>
-        </w:tc>
-        <w:tc>
-          <w:tcPr>
-            <w:tcW w:type="dxa" w:w="1584"/>
-          </w:tcPr>
-          <w:p>
-            <w:r>
-              <w:rPr>
-                <w:sz w:val="16"/>
-              </w:rPr>
-              <w:t>N/A</w:t>
-            </w:r>
-          </w:p>
-        </w:tc>
-        <w:tc>
-          <w:tcPr>
-            <w:tcW w:type="dxa" w:w="2016"/>
-          </w:tcPr>
-          <w:p>
-            <w:r>
-              <w:rPr>
-                <w:sz w:val="16"/>
-              </w:rPr>
-              <w:t>N/A</w:t>
-            </w:r>
-          </w:p>
-        </w:tc>
-        <w:tc>
-          <w:tcPr>
-            <w:tcW w:type="dxa" w:w="1872"/>
-          </w:tcPr>
-          <w:p>
-            <w:r>
-              <w:rPr>
-                <w:sz w:val="16"/>
-              </w:rPr>
-              <w:t>N/A</w:t>
             </w:r>
           </w:p>
         </w:tc>
@@ -2379,101 +1999,6 @@
               <w:rPr>
                 <w:sz w:val="16"/>
               </w:rPr>
-              <w:t>M024</w:t>
-            </w:r>
-          </w:p>
-        </w:tc>
-        <w:tc>
-          <w:tcPr>
-            <w:tcW w:type="dxa" w:w="3168"/>
-          </w:tcPr>
-          <w:p>
-            <w:r>
-              <w:rPr>
-                <w:sz w:val="16"/>
-              </w:rPr>
-              <w:t>Fine-Tuning LLMs for Operational Phishing Email Detection</w:t>
-              <w:br/>
-              <w:t>Armand Piugie, Mathieu Valois, Emmanuel Giguet, Christophe Rosenberger, Philippe Chauvat (2026, Proceedings of the 23rd International Conference on Security and Cryptography)</w:t>
-            </w:r>
-          </w:p>
-        </w:tc>
-        <w:tc>
-          <w:tcPr>
-            <w:tcW w:type="dxa" w:w="1296"/>
-          </w:tcPr>
-          <w:p>
-            <w:r>
-              <w:rPr>
-                <w:sz w:val="16"/>
-              </w:rPr>
-              <w:t>hoang_tran</w:t>
-            </w:r>
-          </w:p>
-        </w:tc>
-        <w:tc>
-          <w:tcPr>
-            <w:tcW w:type="dxa" w:w="1728"/>
-          </w:tcPr>
-          <w:p>
-            <w:r>
-              <w:rPr>
-                <w:sz w:val="16"/>
-              </w:rPr>
-              <w:t>Hoang Tran</w:t>
-            </w:r>
-          </w:p>
-        </w:tc>
-        <w:tc>
-          <w:tcPr>
-            <w:tcW w:type="dxa" w:w="1584"/>
-          </w:tcPr>
-          <w:p>
-            <w:r>
-              <w:rPr>
-                <w:sz w:val="16"/>
-              </w:rPr>
-              <w:t>N/A</w:t>
-            </w:r>
-          </w:p>
-        </w:tc>
-        <w:tc>
-          <w:tcPr>
-            <w:tcW w:type="dxa" w:w="2016"/>
-          </w:tcPr>
-          <w:p>
-            <w:r>
-              <w:rPr>
-                <w:sz w:val="16"/>
-              </w:rPr>
-              <w:t>N/A</w:t>
-            </w:r>
-          </w:p>
-        </w:tc>
-        <w:tc>
-          <w:tcPr>
-            <w:tcW w:type="dxa" w:w="1872"/>
-          </w:tcPr>
-          <w:p>
-            <w:r>
-              <w:rPr>
-                <w:sz w:val="16"/>
-              </w:rPr>
-              <w:t>N/A</w:t>
-            </w:r>
-          </w:p>
-        </w:tc>
-      </w:tr>
-      <w:tr>
-        <w:tc>
-          <w:tcPr>
-            <w:tcW w:type="dxa" w:w="720"/>
-          </w:tcPr>
-          <w:p>
-            <w:r>
-              <w:rPr>
-                <w:sz w:val="16"/>
-              </w:rPr>
               <w:t>M025</w:t>
             </w:r>
           </w:p>
@@ -2569,291 +2094,6 @@
               <w:rPr>
                 <w:sz w:val="16"/>
               </w:rPr>
-              <w:t>M026</w:t>
-            </w:r>
-          </w:p>
-        </w:tc>
-        <w:tc>
-          <w:tcPr>
-            <w:tcW w:type="dxa" w:w="3168"/>
-          </w:tcPr>
-          <w:p>
-            <w:r>
-              <w:rPr>
-                <w:sz w:val="16"/>
-              </w:rPr>
-              <w:t>RefusalGuard-M: a scalable human–machine framework for multi-turn LLM jailbreak evaluation via semantic refusal manifold modeling</w:t>
-              <w:br/>
-              <w:t>Michael Tchuindjang, Nathan Duran, Phil Legg, Faiza Medjek (2026, Cybersecurity)</w:t>
-            </w:r>
-          </w:p>
-        </w:tc>
-        <w:tc>
-          <w:tcPr>
-            <w:tcW w:type="dxa" w:w="1296"/>
-          </w:tcPr>
-          <w:p>
-            <w:r>
-              <w:rPr>
-                <w:sz w:val="16"/>
-              </w:rPr>
-              <w:t>hoang_tran</w:t>
-            </w:r>
-          </w:p>
-        </w:tc>
-        <w:tc>
-          <w:tcPr>
-            <w:tcW w:type="dxa" w:w="1728"/>
-          </w:tcPr>
-          <w:p>
-            <w:r>
-              <w:rPr>
-                <w:sz w:val="16"/>
-              </w:rPr>
-              <w:t>Hoang Tran</w:t>
-            </w:r>
-          </w:p>
-        </w:tc>
-        <w:tc>
-          <w:tcPr>
-            <w:tcW w:type="dxa" w:w="1584"/>
-          </w:tcPr>
-          <w:p>
-            <w:r>
-              <w:rPr>
-                <w:sz w:val="16"/>
-              </w:rPr>
-              <w:t>N/A</w:t>
-            </w:r>
-          </w:p>
-        </w:tc>
-        <w:tc>
-          <w:tcPr>
-            <w:tcW w:type="dxa" w:w="2016"/>
-          </w:tcPr>
-          <w:p>
-            <w:r>
-              <w:rPr>
-                <w:sz w:val="16"/>
-              </w:rPr>
-              <w:t>N/A</w:t>
-            </w:r>
-          </w:p>
-        </w:tc>
-        <w:tc>
-          <w:tcPr>
-            <w:tcW w:type="dxa" w:w="1872"/>
-          </w:tcPr>
-          <w:p>
-            <w:r>
-              <w:rPr>
-                <w:sz w:val="16"/>
-              </w:rPr>
-              <w:t>N/A</w:t>
-            </w:r>
-          </w:p>
-        </w:tc>
-      </w:tr>
-      <w:tr>
-        <w:tc>
-          <w:tcPr>
-            <w:tcW w:type="dxa" w:w="720"/>
-          </w:tcPr>
-          <w:p>
-            <w:r>
-              <w:rPr>
-                <w:sz w:val="16"/>
-              </w:rPr>
-              <w:t>M027</w:t>
-            </w:r>
-          </w:p>
-        </w:tc>
-        <w:tc>
-          <w:tcPr>
-            <w:tcW w:type="dxa" w:w="3168"/>
-          </w:tcPr>
-          <w:p>
-            <w:r>
-              <w:rPr>
-                <w:sz w:val="16"/>
-              </w:rPr>
-              <w:t>TARA: Task-Adaptive Rank Allocation for Efficient Large Language Model Fine-Tuning in Geo-Information Text Classification</w:t>
-              <w:br/>
-              <w:t>Canhui Wang, Juntao Shen, Yicong Feng, Jin Huang, Yanwu Jing, Weiwei Chen, Wanqiang Zhang, Min Wang (2026, ISPRS International Journal of Geo-Information)</w:t>
-            </w:r>
-          </w:p>
-        </w:tc>
-        <w:tc>
-          <w:tcPr>
-            <w:tcW w:type="dxa" w:w="1296"/>
-          </w:tcPr>
-          <w:p>
-            <w:r>
-              <w:rPr>
-                <w:sz w:val="16"/>
-              </w:rPr>
-              <w:t>hoang_tran</w:t>
-            </w:r>
-          </w:p>
-        </w:tc>
-        <w:tc>
-          <w:tcPr>
-            <w:tcW w:type="dxa" w:w="1728"/>
-          </w:tcPr>
-          <w:p>
-            <w:r>
-              <w:rPr>
-                <w:sz w:val="16"/>
-              </w:rPr>
-              <w:t>Hoang Tran</w:t>
-            </w:r>
-          </w:p>
-        </w:tc>
-        <w:tc>
-          <w:tcPr>
-            <w:tcW w:type="dxa" w:w="1584"/>
-          </w:tcPr>
-          <w:p>
-            <w:r>
-              <w:rPr>
-                <w:sz w:val="16"/>
-              </w:rPr>
-              <w:t>N/A</w:t>
-            </w:r>
-          </w:p>
-        </w:tc>
-        <w:tc>
-          <w:tcPr>
-            <w:tcW w:type="dxa" w:w="2016"/>
-          </w:tcPr>
-          <w:p>
-            <w:r>
-              <w:rPr>
-                <w:sz w:val="16"/>
-              </w:rPr>
-              <w:t>N/A</w:t>
-            </w:r>
-          </w:p>
-        </w:tc>
-        <w:tc>
-          <w:tcPr>
-            <w:tcW w:type="dxa" w:w="1872"/>
-          </w:tcPr>
-          <w:p>
-            <w:r>
-              <w:rPr>
-                <w:sz w:val="16"/>
-              </w:rPr>
-              <w:t>N/A</w:t>
-            </w:r>
-          </w:p>
-        </w:tc>
-      </w:tr>
-      <w:tr>
-        <w:tc>
-          <w:tcPr>
-            <w:tcW w:type="dxa" w:w="720"/>
-          </w:tcPr>
-          <w:p>
-            <w:r>
-              <w:rPr>
-                <w:sz w:val="16"/>
-              </w:rPr>
-              <w:t>M028</w:t>
-            </w:r>
-          </w:p>
-        </w:tc>
-        <w:tc>
-          <w:tcPr>
-            <w:tcW w:type="dxa" w:w="3168"/>
-          </w:tcPr>
-          <w:p>
-            <w:r>
-              <w:rPr>
-                <w:sz w:val="16"/>
-              </w:rPr>
-              <w:t>Balancing innovation and rigor at the World Bank Independent Evaluation Group</w:t>
-              <w:br/>
-              <w:t>Harsh Anuj, Estelle Raimondo, Hannah den Boer (2026, OpenAlex Index)</w:t>
-            </w:r>
-          </w:p>
-        </w:tc>
-        <w:tc>
-          <w:tcPr>
-            <w:tcW w:type="dxa" w:w="1296"/>
-          </w:tcPr>
-          <w:p>
-            <w:r>
-              <w:rPr>
-                <w:sz w:val="16"/>
-              </w:rPr>
-              <w:t>hoang_tran</w:t>
-            </w:r>
-          </w:p>
-        </w:tc>
-        <w:tc>
-          <w:tcPr>
-            <w:tcW w:type="dxa" w:w="1728"/>
-          </w:tcPr>
-          <w:p>
-            <w:r>
-              <w:rPr>
-                <w:sz w:val="16"/>
-              </w:rPr>
-              <w:t>Hoang Tran</w:t>
-            </w:r>
-          </w:p>
-        </w:tc>
-        <w:tc>
-          <w:tcPr>
-            <w:tcW w:type="dxa" w:w="1584"/>
-          </w:tcPr>
-          <w:p>
-            <w:r>
-              <w:rPr>
-                <w:sz w:val="16"/>
-              </w:rPr>
-              <w:t>N/A</w:t>
-            </w:r>
-          </w:p>
-        </w:tc>
-        <w:tc>
-          <w:tcPr>
-            <w:tcW w:type="dxa" w:w="2016"/>
-          </w:tcPr>
-          <w:p>
-            <w:r>
-              <w:rPr>
-                <w:sz w:val="16"/>
-              </w:rPr>
-              <w:t>N/A</w:t>
-            </w:r>
-          </w:p>
-        </w:tc>
-        <w:tc>
-          <w:tcPr>
-            <w:tcW w:type="dxa" w:w="1872"/>
-          </w:tcPr>
-          <w:p>
-            <w:r>
-              <w:rPr>
-                <w:sz w:val="16"/>
-              </w:rPr>
-              <w:t>N/A</w:t>
-            </w:r>
-          </w:p>
-        </w:tc>
-      </w:tr>
-      <w:tr>
-        <w:tc>
-          <w:tcPr>
-            <w:tcW w:type="dxa" w:w="720"/>
-          </w:tcPr>
-          <w:p>
-            <w:r>
-              <w:rPr>
-                <w:sz w:val="16"/>
-              </w:rPr>
               <w:t>M029</w:t>
             </w:r>
           </w:p>
@@ -2895,7 +2135,7 @@
               <w:rPr>
                 <w:sz w:val="16"/>
               </w:rPr>
-              <w:t>Quoc Huy</w:t>
+              <w:t>Qwen3.6-Plus, OpenAI GPT-5.5, Doubao-Seed-2.0-pro, Kimi-K2.6, GLM-5-Turbo, MiniMax-2.7, DeepSeek-V4-Pro, Gemini 3.1 Flash Lite, Claude Sonnet 4.6 Thinking.</w:t>
             </w:r>
           </w:p>
         </w:tc>
@@ -2908,7 +2148,7 @@
               <w:rPr>
                 <w:sz w:val="16"/>
               </w:rPr>
-              <w:t>N/A</w:t>
+              <w:t>Dataset Name: FraudSMSWalker. Domain: SMS-to-webpage fraud detection.</w:t>
             </w:r>
           </w:p>
         </w:tc>
@@ -2921,7 +2161,7 @@
               <w:rPr>
                 <w:sz w:val="16"/>
               </w:rPr>
-              <w:t>N/A</w:t>
+              <w:t>Qwen3.6-Plus attained the highest accuracy at 50.93%. Claude Sonnet 4.6 Thinking had the lowest accuracy at 42.06%. Fraud recall ranged from 64.16% to 90.13%, while benign recall ranged from 12.81% to 30.25%. Support rates for evidence spanned 9.59% to 32.19%.</w:t>
             </w:r>
           </w:p>
         </w:tc>
@@ -2934,7 +2174,7 @@
               <w:rPr>
                 <w:sz w:val="16"/>
               </w:rPr>
-              <w:t>N/A</w:t>
+              <w:t>FraudSMSWalker is a controlled benchmark, not a raw sample of naturally observed SMS traffic. Sensitive fields are redacted or normalized, which may reduce linguistic diversity. Live-page evaluation introduces drift as pages change or disappear. Residual stylistic cues may remain after removing metadata. The support audit is judge-based, not a human substitute.</w:t>
             </w:r>
           </w:p>
         </w:tc>
@@ -2990,7 +2230,7 @@
               <w:rPr>
                 <w:sz w:val="16"/>
               </w:rPr>
-              <w:t>Quoc Huy</w:t>
+              <w:t>Teacher LLMs:   - Claude Opus 4.5   - GPT 5.2 Codex   - Gemini 3 Pro   - DeepSeek V3.2    Student SLMs:   - Qwen2.5-0.5B-Instruct   - SmolLM2-135M-Instruct</w:t>
             </w:r>
           </w:p>
         </w:tc>
@@ -3003,7 +2243,7 @@
               <w:rPr>
                 <w:sz w:val="16"/>
               </w:rPr>
-              <w:t>N/A</w:t>
+              <w:t>SMS Spam Collection (contains SMS messages from Grumbletext UK forum, NUS SMS Corpus, Caroline Tag's PhD thesis, and SMS Spam Corpus v.0.1). Domain: SMS spam and smishing detection.</w:t>
             </w:r>
           </w:p>
         </w:tc>
@@ -3016,7 +2256,7 @@
               <w:rPr>
                 <w:sz w:val="16"/>
               </w:rPr>
-              <w:t>N/A</w:t>
+              <w:t>- The best configuration (Claude Opus 4.5 + Qwen2.5-0.5B) achieved 94.31 percent accuracy, 92.65 percent precision, 96.25 percent recall, and 94.42 percent F1 score.   - DeepSeek V3.2 with Qwen2.5-0.5B achieved 92.10 percent accuracy, 91.77 percent precision, 92.50 percent recall, and 92.13 percent F1 score.   - Agentic knowledge distillation substantially outperformed the DPO baseline (e.g., 86-94 percent vs 50-80 percent accuracy).</w:t>
             </w:r>
           </w:p>
         </w:tc>
@@ -3029,7 +2269,15 @@
               <w:rPr>
                 <w:sz w:val="16"/>
               </w:rPr>
-              <w:t>N/A</w:t>
+              <w:t>- Performance is bounded by the teacher LLM's knowledge of the task domain; emerging attack patterns not represented in the LLM's training data may be missed.</w:t>
+              <w:br/>
+              <w:br/>
+              <w:br/>
+              <w:t>- The quality of synthetic data depends on the teacher LLM's knowledge, which may not cover all edge cases in real-world threats.</w:t>
+              <w:br/>
+              <w:br/>
+              <w:br/>
+              <w:t>- Teacher LLMs that generate imbalanced or insufficiently diverse synthetic data (e.g., GPT 5.2 Codex) cause student models to develop biased decision boundaries, resulting in severe precision-recall imbalances.</w:t>
             </w:r>
           </w:p>
         </w:tc>
@@ -3085,7 +2333,7 @@
               <w:rPr>
                 <w:sz w:val="16"/>
               </w:rPr>
-              <w:t>Quoc Huy</w:t>
+              <w:t>- Naive Bayes (NB).   - K-Nearest Neighbors (KNN).   - Support Vector Machines (SVM).   - Linear Discriminant Analysis (LDA).   - Decision Trees (DT).   - Deep Neural Networks (DNN).   - Note: Although Large Language Models (LLMs) and BERT are discussed in the title and literature, they were not empirically tested in the main experiments of this paper.</w:t>
             </w:r>
           </w:p>
         </w:tc>
@@ -3098,7 +2346,7 @@
               <w:rPr>
                 <w:sz w:val="16"/>
               </w:rPr>
-              <w:t>N/A</w:t>
+              <w:t>- Dataset Name: SMS spam dataset from Kaggle.   - Domain: Cybersecurity and SMS spam detection.</w:t>
             </w:r>
           </w:p>
         </w:tc>
@@ -3111,7 +2359,7 @@
               <w:rPr>
                 <w:sz w:val="16"/>
               </w:rPr>
-              <w:t>N/A</w:t>
+              <w:t>- Naive Bayes with TF-IDF achieved 96.2 percent accuracy, with precision of 0.976 for non-spam and 0.754 for spam.   - Support Vector Machines with TF-IDF achieved 94.5 percent accuracy, with precision of 0.926 for non-spam and 0.891 for spam.   - Deep Neural Networks with TF-IDF achieved 91.0 percent accuracy, with recall of 0.991 for non-spam and 0.415 for spam.   - The TF-IDF feature extraction method consistently outperformed the Bag-of-Words approach across all six evaluated classifiers.</w:t>
             </w:r>
           </w:p>
         </w:tc>
@@ -3124,7 +2372,23 @@
               <w:rPr>
                 <w:sz w:val="16"/>
               </w:rPr>
-              <w:t>N/A</w:t>
+              <w:t>- The dataset used contained a disproportionate number of non-spam messages compared to spam messages, which could lead to biased classifier performance.</w:t>
+              <w:br/>
+              <w:br/>
+              <w:br/>
+              <w:t>- Both TF-IDF and Bag-of-Words primarily rely on word frequency and do not fully capture the semantic meaning or contextual relationships between words.</w:t>
+              <w:br/>
+              <w:br/>
+              <w:br/>
+              <w:t>- Models such as K-Nearest Neighbors and Decision Trees exhibited lower performance for spam detection and require further optimization.</w:t>
+              <w:br/>
+              <w:br/>
+              <w:br/>
+              <w:t>- The study was conducted using a single publicly available dataset, meaning results may vary across different datasets and linguistic structures.</w:t>
+              <w:br/>
+              <w:br/>
+              <w:br/>
+              <w:t>- The study did not explore modern deep learning-based language models like Word2Vec, GloVe, or BERT, which could potentially enhance classification accuracy.</w:t>
             </w:r>
           </w:p>
         </w:tc>
@@ -3180,7 +2444,7 @@
               <w:rPr>
                 <w:sz w:val="16"/>
               </w:rPr>
-              <w:t>Quoc Huy</w:t>
+              <w:t>* DeBERTa-v3-base   * GPT-4 (specifically GPT-4 Turbo preview)   * Gemini 1.5 (specifically Gemini Pro)</w:t>
             </w:r>
           </w:p>
         </w:tc>
@@ -3193,7 +2457,7 @@
               <w:rPr>
                 <w:sz w:val="16"/>
               </w:rPr>
-              <w:t>N/A</w:t>
+              <w:t>* Domain: Phishing detection across emails, SMS, URLs, and HTML/Webpages.   * Datasets:   * HuggingFace Phishing Dataset (comprising Mail, SMS, URL, and Website datasets).   * Nazario 5 dataset (comprising SpamAssassin, TREC Spam Corpus, CEAS 08, and Nazario).   * Nigeria 5 dataset / Nigerian Fraud Dataset.   * Synthetic dataset generated via GPT-4.</w:t>
             </w:r>
           </w:p>
         </w:tc>
@@ -3206,7 +2470,7 @@
               <w:rPr>
                 <w:sz w:val="16"/>
               </w:rPr>
-              <w:t>N/A</w:t>
+              <w:t>* On the HuggingFace phishing dataset, DeBERTa V3 achieved a recall of 95.17% and an F1-score of 91.75%, while GPT-4 achieved a recall of 91.04% and an F1-score of 80.52%.   * On the Nazario &amp; Nigerian dataset, DeBERTa V3 achieved a 99.05% recall compared to the LLM's 97.98%.   * On the synthetic dataset, LLMs outperformed DeBERTa V3 with a recall of 100% vs 61.11% and an F1-score of 85.56% vs 37.93%.   * The average prediction latency per sample was 13-15 seconds for LLMs, whereas DeBERTa models took 3.75 milliseconds.</w:t>
             </w:r>
           </w:p>
         </w:tc>
@@ -3219,7 +2483,15 @@
               <w:rPr>
                 <w:sz w:val="16"/>
               </w:rPr>
-              <w:t>N/A</w:t>
+              <w:t>* DeBERTa V3 Limitations: The model initially demonstrated suboptimal generalization to synthetic phishing instances when trained exclusively on real-world datasets, requiring synthetic data integration into the training set to improve performance.</w:t>
+              <w:br/>
+              <w:br/>
+              <w:br/>
+              <w:t>* LLM False Positives: LLMs tended to exhibit binary outcomes and misclassified legitimate URLs lacking known brand associations or containing multiple subdomains (e.g., WordPress blogs). They also falsely flagged genuine emails that had a tone of urgency, lacked personalized greetings, or had significantly old dates.</w:t>
+              <w:br/>
+              <w:br/>
+              <w:br/>
+              <w:t>* LLM False Negatives: LLMs missed hidden threats in legitimate-looking opt-out links, neglected domain authenticity when other benign factors were present, and failed to flag URLs lacking a secure HTTP protocol if the brand name was spelled correctly.</w:t>
             </w:r>
           </w:p>
         </w:tc>
@@ -3275,7 +2547,7 @@
               <w:rPr>
                 <w:sz w:val="16"/>
               </w:rPr>
-              <w:t>Quoc Huy</w:t>
+              <w:t>- BERT (Bidirectional Encoder Representations from Transformers).   - Support Vector Machine (SVM).   - Logistic Regression (also referred to as Logical Regression).   - Naive Bayes.   - Gradient Boosting.   - Random Forest.</w:t>
             </w:r>
           </w:p>
         </w:tc>
@@ -3288,7 +2560,7 @@
               <w:rPr>
                 <w:sz w:val="16"/>
               </w:rPr>
-              <w:t>N/A</w:t>
+              <w:t>- Domain: SMS spam detection and classification to combat abuse in telephone networks.   - Datasets Used: Kaggle SMS dataset.   - Data Science Nigeria (DSN) dataset.   - Self-sourced data collected via Google Forms.</w:t>
             </w:r>
           </w:p>
         </w:tc>
@@ -3301,7 +2573,7 @@
               <w:rPr>
                 <w:sz w:val="16"/>
               </w:rPr>
-              <w:t>N/A</w:t>
+              <w:t>- The Naive Bayes + BERT model achieved the highest testing accuracy at 97.31%.   - The Naive Bayes + BERT model recorded a training accuracy of 96.83%.   - The Naive Bayes + BERT model achieved a precision of 98% and a recall of 99%.   - The Naive Bayes + BERT model had the fastest testing execution time of 0.3 seconds.   - The Naive Bayes + BERT model yielded the lowest error counts with 13 False-Positives and 17 False-Negatives.   - The Gradient Boosting + BERT model achieved a testing accuracy of 96.5%.   - The Logical Regression + BERT model achieved a testing accuracy of 96.14%.   - The SVM + BERT model achieved a testing accuracy of 94.35%.   - The Random Forest + BERT model achieved the lowest testing accuracy at 92.55%.</w:t>
             </w:r>
           </w:p>
         </w:tc>
@@ -3314,7 +2586,23 @@
               <w:rPr>
                 <w:sz w:val="16"/>
               </w:rPr>
-              <w:t>N/A</w:t>
+              <w:t>- The dataset features a class imbalance with far fewer spam records than legitimate ones.</w:t>
+              <w:br/>
+              <w:br/>
+              <w:br/>
+              <w:t>- This imbalance required down-sampling the ham class to ensure parity, which limits the training dataset size and poses a potential performance challenge.</w:t>
+              <w:br/>
+              <w:br/>
+              <w:br/>
+              <w:t>- The study is limited exclusively to the English language due to dataset composition, though it can identify some pidgin words.</w:t>
+              <w:br/>
+              <w:br/>
+              <w:br/>
+              <w:t>- The models may not effectively recognize slang or abbreviations, which could negatively affect results when non-English words are used.</w:t>
+              <w:br/>
+              <w:br/>
+              <w:br/>
+              <w:t>- The initial rule-based filtering approach may not capture all types of spam, particularly those using sophisticated or evolving evasion tactics.</w:t>
             </w:r>
           </w:p>
         </w:tc>
@@ -3370,7 +2658,7 @@
               <w:rPr>
                 <w:sz w:val="16"/>
               </w:rPr>
-              <w:t>Quoc Huy</w:t>
+              <w:t>- DistilBERT and RoBERTa.   - Traditional Machine Learning models: Extreme Gradient Boosting (XGB), Support Vector Machine (SVM), K-Nearest Neighbor (KNN), and Random Forest (RF).   - Explainable AI models: LIME and Transformers Interpret.</w:t>
             </w:r>
           </w:p>
         </w:tc>
@@ -3383,7 +2671,7 @@
               <w:rPr>
                 <w:sz w:val="16"/>
               </w:rPr>
-              <w:t>N/A</w:t>
+              <w:t>- Benchmark SMS spam dataset from the UCI machine learning repository.   - Domain: Cybersecurity, specifically SMS spam detection.</w:t>
             </w:r>
           </w:p>
         </w:tc>
@@ -3396,7 +2684,7 @@
               <w:rPr>
                 <w:sz w:val="16"/>
               </w:rPr>
-              <w:t>N/A</w:t>
+              <w:t>- On the balanced dataset, the fine-tuned RoBERTa model achieved 99.95% training accuracy, 99.84% testing accuracy, and 0.0122 testing loss.   - On the imbalanced dataset, RoBERTa achieved 99.69% training accuracy and 99.37% testing accuracy with a 0.0292 testing loss.</w:t>
             </w:r>
           </w:p>
         </w:tc>
@@ -3409,7 +2697,15 @@
               <w:rPr>
                 <w:sz w:val="16"/>
               </w:rPr>
-              <w:t>N/A</w:t>
+              <w:t>- The initial dataset was significantly imbalanced, requiring back translation and oversampling for mitigation.</w:t>
+              <w:br/>
+              <w:br/>
+              <w:br/>
+              <w:t>- The number of features in the LIME explainer was limited to 15 to accelerate the computational explanation process and reduce dimensionality.</w:t>
+              <w:br/>
+              <w:br/>
+              <w:br/>
+              <w:t>- The experimental analysis only used one benchmark dataset of spam messages, requiring future exploration on different, diverse datasets.</w:t>
             </w:r>
           </w:p>
         </w:tc>
@@ -3465,7 +2761,7 @@
               <w:rPr>
                 <w:sz w:val="16"/>
               </w:rPr>
-              <w:t>Quoc Huy</w:t>
+              <w:t>* Llama 3.1 8B (used as Generator, fine-tuned with LoRA).   * GPT-2 (evaluated as a baseline generator in the ablation study).   * Bidirectional Long Short-Term Memory (Bi-LSTM, used as the Discriminator).   * ChatGPT (gpt-3.5-turbo, utilized as the Phishing Analyzer).   * ALBERT, RoBERTa, SQ, DistilBERT, RoBERTa-Syn, and T5-Encoder (utilized as phishing detection models).   * TextFooler, PWWS, Pruthi, and DeepWordBug (used as text perturbation attack frameworks).</w:t>
             </w:r>
           </w:p>
         </w:tc>
@@ -3478,7 +2774,7 @@
               <w:rPr>
                 <w:sz w:val="16"/>
               </w:rPr>
-              <w:t>N/A</w:t>
+              <w:t>* Domains covered: Phishing and Benign Emails.   * Source datasets: IWSPA-AP, Nazario Phishing Corpus, Miller Smiles, Phish Bowl, CLAIR collection of "Nigerian" fraud emails, Cambridge dataset, and the Enron Email Dataset.   * Comparison synthetic datasets: IWSPA 2023 phishing, DeepAI-phishing.</w:t>
             </w:r>
           </w:p>
         </w:tc>
@@ -3491,7 +2787,7 @@
               <w:rPr>
                 <w:sz w:val="16"/>
               </w:rPr>
-              <w:t>N/A</w:t>
+              <w:t>* PEEK generated content with an LLM-GC score of 0.83 and a PPL of 6.95.   * 84.8% of PEEK-generated samples achieved a PAS of 6 or higher.   * Cross-topic generation maintained a high PAS of 88.1%.   * 40.9% of PEEK anomalies utilized five persuasion principles, compared to only 17.11% in traditional phishing emails.   * Fine-tuning detectors with PEEK phishing increased F1-scores to over 0.88 and reduced ASR by up to 70% against adversarial attacks.   * For specific models, ALBERT's ASR fell from 67.15% to 40.91%, and RoBERTa's ASR dropped from 14.81% to 8.76%.</w:t>
             </w:r>
           </w:p>
         </w:tc>
@@ -3504,7 +2800,19 @@
               <w:rPr>
                 <w:sz w:val="16"/>
               </w:rPr>
-              <w:t>N/A</w:t>
+              <w:t>* The open accessibility of the fine-tuned generator introduces a risk of adversarial misuse for scalable cross-topic phishing campaigns.</w:t>
+              <w:br/>
+              <w:br/>
+              <w:br/>
+              <w:t>* The framework's evaluation is restricted to plain-text emails, ignoring multi-modal attack vectors like QR codes or image-based notifications.</w:t>
+              <w:br/>
+              <w:br/>
+              <w:br/>
+              <w:t>* Prompt-based generation strategies may conflict with ethical constraints baked into modern LLMs.</w:t>
+              <w:br/>
+              <w:br/>
+              <w:br/>
+              <w:t>* Static LLM analyzers may struggle over time, requiring updates (e.g., retrieving augmented generation) to adapt to continuously evolving threats.</w:t>
             </w:r>
           </w:p>
         </w:tc>
@@ -3560,7 +2868,7 @@
               <w:rPr>
                 <w:sz w:val="16"/>
               </w:rPr>
-              <w:t>Quoc Huy</w:t>
+              <w:t>GPT-3.5 (LLM defender), textattack/bert-base-uncased-SST-2, mariagrandury/roberta-base-finetuned-sms-spam-detection (LM analyzers), and SHAP (Interpreter).</w:t>
             </w:r>
           </w:p>
         </w:tc>
@@ -3573,7 +2881,7 @@
               <w:rPr>
                 <w:sz w:val="16"/>
               </w:rPr>
-              <w:t>N/A</w:t>
+              <w:t>stanfordnlp/sst2 (Sentiment Analysis), dair-ai/emotion (Sentiment Analysis), and Deysi/spam-detection-dataset (Spam Detection).</w:t>
             </w:r>
           </w:p>
         </w:tc>
@@ -3586,7 +2894,7 @@
               <w:rPr>
                 <w:sz w:val="16"/>
               </w:rPr>
-              <w:t>N/A</w:t>
+              <w:t>The LLM defender shields an average of 81.6% of successful textual attacks at a 0.15 disturbance ratio. The recovery ratio reaches up to 99.5% for the LLM attacker on the spam-detection dataset.</w:t>
             </w:r>
           </w:p>
         </w:tc>
@@ -3599,7 +2907,7 @@
               <w:rPr>
                 <w:sz w:val="16"/>
               </w:rPr>
-              <w:t>N/A</w:t>
+              <w:t>The LLM attacker lacks controllability for specified disturbance ratios or creating large disturbances. The general defender prompt may struggle with domain-specific tasks (like medical records) without RAG integration. The framework is currently restricted to textual information and cannot process multi-modal data.</w:t>
             </w:r>
           </w:p>
         </w:tc>
@@ -3655,7 +2963,7 @@
               <w:rPr>
                 <w:sz w:val="16"/>
               </w:rPr>
-              <w:t>Quoc Huy</w:t>
+              <w:t>Proposed LLM: RoBERTa (Robustly Optimized BERT Pretraining Approach)  Explainability Tools: LIME, Transformers Interpret, LITA (LIME-Transformer Attribution - the authors' proposed hybrid approach)  Baseline ML Models: Random Forest (RF), Extreme Gradient Boosting (XGB), Support Vector Machine (SVM), Logistic Regression (LR)</w:t>
             </w:r>
           </w:p>
         </w:tc>
@@ -3668,7 +2976,7 @@
               <w:rPr>
                 <w:sz w:val="16"/>
               </w:rPr>
-              <w:t>N/A</w:t>
+              <w:t>Phishing Email Dataset from Kaggle (Cybersecurity / Text Classification)</w:t>
             </w:r>
           </w:p>
         </w:tc>
@@ -3681,7 +2989,7 @@
               <w:rPr>
                 <w:sz w:val="16"/>
               </w:rPr>
-              <w:t>N/A</w:t>
+              <w:t>Balanced Dataset (RoBERTa): Testing Accuracy: 98.45% | Validation Accuracy: 98.68% | F1-Score: 0.98  Imbalanced Dataset (RoBERTa): Testing Accuracy: 97.96% | Validation Accuracy: 98.05% | F1-Score: 0.98</w:t>
             </w:r>
           </w:p>
         </w:tc>
@@ -3694,7 +3002,10 @@
               <w:rPr>
                 <w:sz w:val="16"/>
               </w:rPr>
-              <w:t>N/A</w:t>
+              <w:t>Conflicting Explainability: The authors note that individual XAI methods like LIME and Transformers Interpret can assign opposite polarities (positive vs. negative contribution) to the exact same word, leading to user confusion (which they attempt to solve with their LITA hybrid model).</w:t>
+              <w:br/>
+              <w:br/>
+              <w:t>Dataset Scope: The authors exclusively used a phishing-specific dataset and excluded broader spam datasets, which may limit the generalizability of their findings across generalized email filtering systems.</w:t>
             </w:r>
           </w:p>
         </w:tc>
@@ -3750,7 +3061,7 @@
               <w:rPr>
                 <w:sz w:val="16"/>
               </w:rPr>
-              <w:t>Quoc Huy</w:t>
+              <w:t>IPSDM (fine-tuning the BERT family of models)</w:t>
             </w:r>
           </w:p>
         </w:tc>
@@ -3763,7 +3074,7 @@
               <w:rPr>
                 <w:sz w:val="16"/>
               </w:rPr>
-              <w:t>N/A</w:t>
+              <w:t>Email datasets (unbalanced and balanced datasets)</w:t>
             </w:r>
           </w:p>
         </w:tc>
@@ -3776,7 +3087,7 @@
               <w:rPr>
                 <w:sz w:val="16"/>
               </w:rPr>
-              <w:t>N/A</w:t>
+              <w:t>IPSDM / RoBERTA (Balanced): Validation Accuracy 98.99% | Test Accuracy 99.00% | Test F1-Score 0.985  IPSDM / DistilBERT (Balanced): Validation Accuracy 97.50% | Test Accuracy 97.10% | Test F1-Score 0.9710  IPSDM / RoBERTA (Imbalanced): Validation Accuracy 66.97% | Test Accuracy 67.86% | Test F1-Score 0.893  IPSDM / DistilBERT (Imbalanced): Validation Accuracy 51.32% | Test Accuracy 53.67% | Test F1-Score 0.621</w:t>
             </w:r>
           </w:p>
         </w:tc>
@@ -3789,7 +3100,10 @@
               <w:rPr>
                 <w:sz w:val="16"/>
               </w:rPr>
-              <w:t>N/A</w:t>
+              <w:t>Class Bias on Unbalanced Data: In the original imbalanced setting, the model struggles significantly to classify the minority "spam" and "phishing" classes, resulting in low recall and heavily biased predictions toward the majority "ham" class.</w:t>
+              <w:br/>
+              <w:br/>
+              <w:t>Accuracy Metric Flaws: The authors acknowledge that relying purely on accuracy suffers from limitations and can yield biased interpretations on imbalanced datasets, requiring the evaluation of precision, recall, and F1-scores to get a true picture of performance.</w:t>
             </w:r>
           </w:p>
         </w:tc>

</xml_diff>